<commit_message>
docs: align final report with verified Windows HTTP fix
</commit_message>
<xml_diff>
--- a/docs/report/AutoHeal_Project_Report.docx
+++ b/docs/report/AutoHeal_Project_Report.docx
@@ -123,7 +123,7 @@
           <w:color w:val="000000"/>
           <w:sz w:val="19"/>
         </w:rPr>
-        <w:t>Implementation revision e5a064a7f31a. The report records this source snapshot and the evidence identified in its final section.</w:t>
+        <w:t>Implementation revision c3ba20afe522. The report records this source snapshot and the evidence identified in its final section.</w:t>
       </w:r>
     </w:p>
     <w:p>
@@ -8440,7 +8440,7 @@
           <w:color w:val="000000"/>
           <w:sz w:val="22"/>
         </w:rPr>
-        <w:t>The current implementation passed 63 automated tests in 14.162 seconds in the recorded environment. The archived test log is docs/evidence/test-results.txt. This is a measured software verification result, separate from model coding benchmarks and live run pass rates.</w:t>
+        <w:t>The current implementation passed 63 automated tests in 13.496 seconds in the recorded environment. The archived test log is docs/evidence/post-ci-test-results.txt. This is a measured software verification result, separate from model coding benchmarks and live run pass rates.</w:t>
       </w:r>
     </w:p>
     <w:p>
@@ -9204,7 +9204,7 @@
           <w:color w:val="000000"/>
           <w:sz w:val="20"/>
         </w:rPr>
-        <w:t>The Windows and Linux GitHub Actions jobs also passed for implementation revision e5a064a. This cross-platform check verifies the test suite on both runners; it is separate from the laptop latency measurements.</w:t>
+        <w:t>Windows CI exposed a TCP reset when an early rejected POST left request bytes unread. HTTP 403/415 handling now drains a declared body of at most 32KB within a 250ms deadline before closing. Access guards stay unchanged. Repeated-rejection and incomplete-body regressions pass in the 63-test suite. Both Windows and Linux CI jobs subsequently passed.</w:t>
       </w:r>
     </w:p>
     <w:p>
@@ -9228,7 +9228,7 @@
             <w:sz w:val="19"/>
             <w:color w:val="000000"/>
           </w:rPr>
-          <w:t>GitHub Actions verification run 38933564801</w:t>
+          <w:t>Current GitHub Actions verification run 38936939670</w:t>
         </w:r>
       </w:hyperlink>
     </w:p>
@@ -9262,7 +9262,7 @@
           <w:color w:val="000000"/>
           <w:sz w:val="22"/>
         </w:rPr>
-        <w:t>The table records the current evaluation cases associated with this implementation revision. Each entry has a saved trace. Durations cover complete runs rather than only Python execution. Manual flow may include time spent waiting for human continuation and should not be compared directly with uninterrupted automatic latency.</w:t>
+        <w:t>The six model cases were measured at revision 075598e, before the later HTTP-only correction. Model generation, Python execution and validation are identical in the current revision, so these traces remain applicable. Durations cover complete automatic runs. The separate manual screenshot run may include human waiting and should not be compared directly with this latency.</w:t>
       </w:r>
     </w:p>
     <w:tbl>
@@ -12409,7 +12409,7 @@
           <w:color w:val="000000"/>
           <w:sz w:val="19"/>
         </w:rPr>
-        <w:t>Version 2.0.0  |  Implementation revision e5a064a7f31ac2c452127edef850e8b99066be6f  |  16 October 2026</w:t>
+        <w:t>Version 2.0.0  |  Implementation revision c3ba20afe522a9c41b921342fc22444d8e17b4a0  |  16 October 2026</w:t>
       </w:r>
     </w:p>
     <w:p>
@@ -12450,7 +12450,7 @@
           <w:color w:val="000000"/>
           <w:sz w:val="19"/>
         </w:rPr>
-        <w:t>Reproduce the software checks with the command in the automated verification section. The recorded test log is docs/evidence/test-results.txt. Current run records are indexed by docs/evidence/live-summary.json, and UI captures by docs/screenshots/index.json. These files connect the report to source and observed execution.</w:t>
+        <w:t>Reproduce the software checks with the command in the automated verification section. The recorded test log is docs/evidence/post-ci-test-results.txt. Current run records are indexed by docs/evidence/live-summary.json, and UI captures by docs/screenshots/index.json. These files connect the report to source and observed execution.</w:t>
       </w:r>
     </w:p>
     <w:p>

</xml_diff>